<commit_message>
show particulars and hide 3D workspace in clerkships
</commit_message>
<xml_diff>
--- a/Paediatric clerkship sheet.docx
+++ b/Paediatric clerkship sheet.docx
@@ -1,15 +1,10 @@
 
 <file path=word/document.xml><?xml version="1.0" encoding="utf-8"?>
-<w:document xmlns:wpc="http://schemas.microsoft.com/office/word/2010/wordprocessingCanvas" xmlns:mc="http://schemas.openxmlformats.org/markup-compatibility/2006" xmlns:o="urn:schemas-microsoft-com:office:office" xmlns:r="http://schemas.openxmlformats.org/officeDocument/2006/relationships" xmlns:m="http://schemas.openxmlformats.org/officeDocument/2006/math" xmlns:v="urn:schemas-microsoft-com:vml" xmlns:wp14="http://schemas.microsoft.com/office/word/2010/wordprocessingDrawing" xmlns:wp="http://schemas.openxmlformats.org/drawingml/2006/wordprocessingDrawing" xmlns:w10="urn:schemas-microsoft-com:office:word" xmlns:w="http://schemas.openxmlformats.org/wordprocessingml/2006/main" xmlns:w14="http://schemas.microsoft.com/office/word/2010/wordml" xmlns:w15="http://schemas.microsoft.com/office/word/2012/wordml" xmlns:wpg="http://schemas.microsoft.com/office/word/2010/wordprocessingGroup" xmlns:wpi="http://schemas.microsoft.com/office/word/2010/wordprocessingInk" xmlns:wne="http://schemas.microsoft.com/office/word/2006/wordml" xmlns:wps="http://schemas.microsoft.com/office/word/2010/wordprocessingShape" mc:Ignorable="w14 w15 wp14">
+<w:document xmlns:wpc="http://schemas.microsoft.com/office/word/2010/wordprocessingCanvas" xmlns:cx="http://schemas.microsoft.com/office/drawing/2014/chartex" xmlns:cx1="http://schemas.microsoft.com/office/drawing/2015/9/8/chartex" xmlns:cx2="http://schemas.microsoft.com/office/drawing/2015/10/21/chartex" xmlns:cx3="http://schemas.microsoft.com/office/drawing/2016/5/9/chartex" xmlns:cx4="http://schemas.microsoft.com/office/drawing/2016/5/10/chartex" xmlns:cx5="http://schemas.microsoft.com/office/drawing/2016/5/11/chartex" xmlns:cx6="http://schemas.microsoft.com/office/drawing/2016/5/12/chartex" xmlns:cx7="http://schemas.microsoft.com/office/drawing/2016/5/13/chartex" xmlns:cx8="http://schemas.microsoft.com/office/drawing/2016/5/14/chartex" xmlns:mc="http://schemas.openxmlformats.org/markup-compatibility/2006" xmlns:aink="http://schemas.microsoft.com/office/drawing/2016/ink" xmlns:am3d="http://schemas.microsoft.com/office/drawing/2017/model3d" xmlns:o="urn:schemas-microsoft-com:office:office" xmlns:oel="http://schemas.microsoft.com/office/2019/extlst" xmlns:r="http://schemas.openxmlformats.org/officeDocument/2006/relationships" xmlns:m="http://schemas.openxmlformats.org/officeDocument/2006/math" xmlns:v="urn:schemas-microsoft-com:vml" xmlns:wp14="http://schemas.microsoft.com/office/word/2010/wordprocessingDrawing" xmlns:wp="http://schemas.openxmlformats.org/drawingml/2006/wordprocessingDrawing" xmlns:w10="urn:schemas-microsoft-com:office:word" xmlns:w="http://schemas.openxmlformats.org/wordprocessingml/2006/main" xmlns:w14="http://schemas.microsoft.com/office/word/2010/wordml" xmlns:w15="http://schemas.microsoft.com/office/word/2012/wordml" xmlns:w16cex="http://schemas.microsoft.com/office/word/2018/wordml/cex" xmlns:w16cid="http://schemas.microsoft.com/office/word/2016/wordml/cid" xmlns:w16="http://schemas.microsoft.com/office/word/2018/wordml" xmlns:w16du="http://schemas.microsoft.com/office/word/2023/wordml/word16du" xmlns:w16sdtdh="http://schemas.microsoft.com/office/word/2020/wordml/sdtdatahash" xmlns:w16sdtfl="http://schemas.microsoft.com/office/word/2024/wordml/sdtformatlock" xmlns:w16se="http://schemas.microsoft.com/office/word/2015/wordml/symex" xmlns:wpg="http://schemas.microsoft.com/office/word/2010/wordprocessingGroup" xmlns:wpi="http://schemas.microsoft.com/office/word/2010/wordprocessingInk" xmlns:wne="http://schemas.microsoft.com/office/word/2006/wordml" xmlns:wps="http://schemas.microsoft.com/office/word/2010/wordprocessingShape" mc:Ignorable="w14 w15 w16se w16cid w16 w16cex w16sdtdh w16sdtfl w16du wp14">
   <w:body>
     <w:p>
-      <w:proofErr w:type="spellStart"/>
-      <w:r>
-        <w:t>Paediatric</w:t>
-      </w:r>
-      <w:proofErr w:type="spellEnd"/>
-      <w:r>
-        <w:t xml:space="preserve"> clerkship sheet</w:t>
+      <w:r>
+        <w:t>Paediatric clerkship sheet</w:t>
       </w:r>
     </w:p>
     <w:p>
@@ -18,13 +13,8 @@
       </w:r>
     </w:p>
     <w:p>
-      <w:proofErr w:type="spellStart"/>
-      <w:r>
-        <w:t>Escortee</w:t>
-      </w:r>
-      <w:proofErr w:type="spellEnd"/>
-      <w:r>
-        <w:t xml:space="preserve"> particulars:</w:t>
+      <w:r>
+        <w:t>Escortee particulars:</w:t>
       </w:r>
     </w:p>
     <w:p>
@@ -70,8 +60,6 @@
       <w:r>
         <w:t>……</w:t>
       </w:r>
-      <w:bookmarkStart w:id="0" w:name="_GoBack"/>
-      <w:bookmarkEnd w:id="0"/>
     </w:p>
     <w:p>
       <w:r>
@@ -90,31 +78,83 @@
       </w:r>
     </w:p>
     <w:p>
-      <w:r>
+      <w:pPr>
+        <w:rPr>
+          <w:b/>
+          <w:bCs/>
+        </w:rPr>
+      </w:pPr>
+      <w:r>
+        <w:rPr>
+          <w:b/>
+          <w:bCs/>
+        </w:rPr>
         <w:t>Oral habits……………</w:t>
       </w:r>
       <w:r>
+        <w:rPr>
+          <w:b/>
+          <w:bCs/>
+        </w:rPr>
         <w:t>…………………….</w:t>
       </w:r>
     </w:p>
     <w:p>
-      <w:r>
+      <w:pPr>
+        <w:rPr>
+          <w:b/>
+          <w:bCs/>
+        </w:rPr>
+      </w:pPr>
+      <w:r>
+        <w:rPr>
+          <w:b/>
+          <w:bCs/>
+        </w:rPr>
         <w:t>Oral hygiene practices……</w:t>
       </w:r>
       <w:r>
+        <w:rPr>
+          <w:b/>
+          <w:bCs/>
+        </w:rPr>
         <w:t>………….</w:t>
       </w:r>
     </w:p>
     <w:p>
-      <w:r>
+      <w:pPr>
+        <w:rPr>
+          <w:b/>
+          <w:bCs/>
+        </w:rPr>
+      </w:pPr>
+      <w:r>
+        <w:rPr>
+          <w:b/>
+          <w:bCs/>
+        </w:rPr>
         <w:t>Dietary habit…………………………</w:t>
       </w:r>
       <w:r>
+        <w:rPr>
+          <w:b/>
+          <w:bCs/>
+        </w:rPr>
         <w:t>…..</w:t>
       </w:r>
     </w:p>
     <w:p>
-      <w:r>
+      <w:pPr>
+        <w:rPr>
+          <w:b/>
+          <w:bCs/>
+        </w:rPr>
+      </w:pPr>
+      <w:r>
+        <w:rPr>
+          <w:b/>
+          <w:bCs/>
+        </w:rPr>
         <w:t>Review of system …………………….</w:t>
       </w:r>
     </w:p>
@@ -144,18 +184,63 @@
       </w:r>
     </w:p>
     <w:p>
-      <w:r>
+      <w:pPr>
+        <w:rPr>
+          <w:b/>
+          <w:bCs/>
+        </w:rPr>
+      </w:pPr>
+      <w:r>
+        <w:rPr>
+          <w:b/>
+          <w:bCs/>
+        </w:rPr>
         <w:t>Diagnosis …………………………………..</w:t>
       </w:r>
     </w:p>
     <w:p>
-      <w:r>
+      <w:pPr>
+        <w:rPr>
+          <w:b/>
+          <w:bCs/>
+        </w:rPr>
+      </w:pPr>
+      <w:r>
+        <w:rPr>
+          <w:b/>
+          <w:bCs/>
+        </w:rPr>
         <w:t>Treatment objectives…………………..</w:t>
       </w:r>
     </w:p>
     <w:p>
-      <w:r>
+      <w:pPr>
+        <w:rPr>
+          <w:b/>
+          <w:bCs/>
+        </w:rPr>
+      </w:pPr>
+      <w:r>
+        <w:rPr>
+          <w:b/>
+          <w:bCs/>
+        </w:rPr>
         <w:t>Treatment plan……………………………</w:t>
+      </w:r>
+    </w:p>
+    <w:p>
+      <w:pPr>
+        <w:rPr>
+          <w:b/>
+          <w:bCs/>
+        </w:rPr>
+      </w:pPr>
+      <w:r>
+        <w:rPr>
+          <w:b/>
+          <w:bCs/>
+        </w:rPr>
+        <w:t>Procedures…………………………………</w:t>
       </w:r>
     </w:p>
     <w:p/>
@@ -174,7 +259,7 @@
 </file>
 
 <file path=word/styles.xml><?xml version="1.0" encoding="utf-8"?>
-<w:styles xmlns:mc="http://schemas.openxmlformats.org/markup-compatibility/2006" xmlns:r="http://schemas.openxmlformats.org/officeDocument/2006/relationships" xmlns:w="http://schemas.openxmlformats.org/wordprocessingml/2006/main" xmlns:w14="http://schemas.microsoft.com/office/word/2010/wordml" xmlns:w15="http://schemas.microsoft.com/office/word/2012/wordml" mc:Ignorable="w14 w15">
+<w:styles xmlns:mc="http://schemas.openxmlformats.org/markup-compatibility/2006" xmlns:r="http://schemas.openxmlformats.org/officeDocument/2006/relationships" xmlns:w="http://schemas.openxmlformats.org/wordprocessingml/2006/main" xmlns:w14="http://schemas.microsoft.com/office/word/2010/wordml" xmlns:w15="http://schemas.microsoft.com/office/word/2012/wordml" xmlns:w16cex="http://schemas.microsoft.com/office/word/2018/wordml/cex" xmlns:w16cid="http://schemas.microsoft.com/office/word/2016/wordml/cid" xmlns:w16="http://schemas.microsoft.com/office/word/2018/wordml" xmlns:w16du="http://schemas.microsoft.com/office/word/2023/wordml/word16du" xmlns:w16sdtdh="http://schemas.microsoft.com/office/word/2020/wordml/sdtdatahash" xmlns:w16sdtfl="http://schemas.microsoft.com/office/word/2024/wordml/sdtformatlock" xmlns:w16se="http://schemas.microsoft.com/office/word/2015/wordml/symex" mc:Ignorable="w14 w15 w16se w16cid w16 w16cex w16sdtdh w16sdtfl w16du">
   <w:docDefaults>
     <w:rPrDefault>
       <w:rPr>
@@ -190,7 +275,7 @@
       </w:pPr>
     </w:pPrDefault>
   </w:docDefaults>
-  <w:latentStyles w:defLockedState="0" w:defUIPriority="99" w:defSemiHidden="0" w:defUnhideWhenUsed="0" w:defQFormat="0" w:count="371">
+  <w:latentStyles w:defLockedState="0" w:defUIPriority="99" w:defSemiHidden="0" w:defUnhideWhenUsed="0" w:defQFormat="0" w:count="376">
     <w:lsdException w:name="Normal" w:uiPriority="0" w:qFormat="1"/>
     <w:lsdException w:name="heading 1" w:uiPriority="9" w:qFormat="1"/>
     <w:lsdException w:name="heading 2" w:semiHidden="1" w:uiPriority="9" w:unhideWhenUsed="1" w:qFormat="1"/>
@@ -562,6 +647,11 @@
     <w:lsdException w:name="List Table 5 Dark Accent 6" w:uiPriority="50"/>
     <w:lsdException w:name="List Table 6 Colorful Accent 6" w:uiPriority="51"/>
     <w:lsdException w:name="List Table 7 Colorful Accent 6" w:uiPriority="52"/>
+    <w:lsdException w:name="Mention" w:semiHidden="1" w:unhideWhenUsed="1"/>
+    <w:lsdException w:name="Smart Hyperlink" w:semiHidden="1" w:unhideWhenUsed="1"/>
+    <w:lsdException w:name="Hashtag" w:semiHidden="1" w:unhideWhenUsed="1"/>
+    <w:lsdException w:name="Unresolved Mention" w:semiHidden="1" w:unhideWhenUsed="1"/>
+    <w:lsdException w:name="Smart Link" w:semiHidden="1" w:unhideWhenUsed="1"/>
   </w:latentStyles>
   <w:style w:type="paragraph" w:default="1" w:styleId="Normal">
     <w:name w:val="Normal"/>

</xml_diff>

<commit_message>
add modules page and continue with creckship ammendiments
</commit_message>
<xml_diff>
--- a/Paediatric clerkship sheet.docx
+++ b/Paediatric clerkship sheet.docx
@@ -4,7 +4,15 @@
   <w:body>
     <w:p>
       <w:r>
-        <w:t>Paediatric clerkship sheet</w:t>
+        <w:t xml:space="preserve"> </w:t>
+      </w:r>
+      <w:proofErr w:type="spellStart"/>
+      <w:r>
+        <w:t>Paediatric</w:t>
+      </w:r>
+      <w:proofErr w:type="spellEnd"/>
+      <w:r>
+        <w:t xml:space="preserve"> clerkship sheet</w:t>
       </w:r>
     </w:p>
     <w:p>
@@ -13,8 +21,13 @@
       </w:r>
     </w:p>
     <w:p>
-      <w:r>
-        <w:t>Escortee particulars:</w:t>
+      <w:proofErr w:type="spellStart"/>
+      <w:r>
+        <w:t>Escortee</w:t>
+      </w:r>
+      <w:proofErr w:type="spellEnd"/>
+      <w:r>
+        <w:t xml:space="preserve"> particulars:</w:t>
       </w:r>
     </w:p>
     <w:p>
@@ -135,6 +148,7 @@
         </w:rPr>
         <w:t>Dietary habit…………………………</w:t>
       </w:r>
+      <w:proofErr w:type="gramStart"/>
       <w:r>
         <w:rPr>
           <w:b/>
@@ -142,6 +156,7 @@
         </w:rPr>
         <w:t>…..</w:t>
       </w:r>
+      <w:proofErr w:type="gramEnd"/>
     </w:p>
     <w:p>
       <w:pPr>
@@ -165,13 +180,23 @@
     </w:p>
     <w:p>
       <w:r>
-        <w:t>Extra-oral examination ……………..</w:t>
-      </w:r>
-    </w:p>
-    <w:p>
-      <w:r>
-        <w:t>Intraoral examination ………………..</w:t>
-      </w:r>
+        <w:t>Extra-oral examination …………</w:t>
+      </w:r>
+      <w:proofErr w:type="gramStart"/>
+      <w:r>
+        <w:t>…..</w:t>
+      </w:r>
+      <w:proofErr w:type="gramEnd"/>
+    </w:p>
+    <w:p>
+      <w:r>
+        <w:t>Intraoral examination ……………</w:t>
+      </w:r>
+      <w:proofErr w:type="gramStart"/>
+      <w:r>
+        <w:t>…..</w:t>
+      </w:r>
+      <w:proofErr w:type="gramEnd"/>
     </w:p>
     <w:p>
       <w:r>
@@ -180,8 +205,13 @@
     </w:p>
     <w:p>
       <w:r>
-        <w:t>Investigation ……………………………..</w:t>
-      </w:r>
+        <w:t>Investigation …………………………</w:t>
+      </w:r>
+      <w:proofErr w:type="gramStart"/>
+      <w:r>
+        <w:t>…..</w:t>
+      </w:r>
+      <w:proofErr w:type="gramEnd"/>
     </w:p>
     <w:p>
       <w:pPr>
@@ -195,8 +225,17 @@
           <w:b/>
           <w:bCs/>
         </w:rPr>
-        <w:t>Diagnosis …………………………………..</w:t>
-      </w:r>
+        <w:t>Diagnosis ………………………………</w:t>
+      </w:r>
+      <w:proofErr w:type="gramStart"/>
+      <w:r>
+        <w:rPr>
+          <w:b/>
+          <w:bCs/>
+        </w:rPr>
+        <w:t>…..</w:t>
+      </w:r>
+      <w:proofErr w:type="gramEnd"/>
     </w:p>
     <w:p>
       <w:pPr>
@@ -210,8 +249,17 @@
           <w:b/>
           <w:bCs/>
         </w:rPr>
-        <w:t>Treatment objectives…………………..</w:t>
-      </w:r>
+        <w:t>Treatment objectives………………</w:t>
+      </w:r>
+      <w:proofErr w:type="gramStart"/>
+      <w:r>
+        <w:rPr>
+          <w:b/>
+          <w:bCs/>
+        </w:rPr>
+        <w:t>…..</w:t>
+      </w:r>
+      <w:proofErr w:type="gramEnd"/>
     </w:p>
     <w:p>
       <w:pPr>

</xml_diff>